<commit_message>
Sensitive data are moved to appsettings.json
</commit_message>
<xml_diff>
--- a/Documentation/Vizsga_dokumentacio.docx
+++ b/Documentation/Vizsga_dokumentacio.docx
@@ -36,8 +36,13 @@
         </w:numPr>
         <w:jc w:val="both"/>
       </w:pPr>
-      <w:r>
-        <w:t>Tempfli Vivien</w:t>
+      <w:proofErr w:type="spellStart"/>
+      <w:r>
+        <w:t>Tempfli</w:t>
+      </w:r>
+      <w:proofErr w:type="spellEnd"/>
+      <w:r>
+        <w:t xml:space="preserve"> Vivien</w:t>
       </w:r>
     </w:p>
     <w:p>
@@ -303,7 +308,15 @@
         <w:jc w:val="both"/>
       </w:pPr>
       <w:r>
-        <w:t>A rendszer a jogosultságokat a következőkben leírt adatbázis szerkezetben, a „rank”</w:t>
+        <w:t>A rendszer a jogosultságokat a következőkben leírt adatbázis szerkezetben, a „</w:t>
+      </w:r>
+      <w:proofErr w:type="spellStart"/>
+      <w:r>
+        <w:t>rank</w:t>
+      </w:r>
+      <w:proofErr w:type="spellEnd"/>
+      <w:r>
+        <w:t>”</w:t>
       </w:r>
       <w:r>
         <w:t xml:space="preserve"> mezőben tárolt érték alapján határozza meg.</w:t>
@@ -395,6 +408,16 @@
       </w:r>
     </w:p>
     <w:p/>
+    <w:p>
+      <w:r>
+        <w:t xml:space="preserve">Tábla: </w:t>
+      </w:r>
+      <w:proofErr w:type="spellStart"/>
+      <w:r>
+        <w:t>users</w:t>
+      </w:r>
+      <w:proofErr w:type="spellEnd"/>
+    </w:p>
     <w:tbl>
       <w:tblPr>
         <w:tblStyle w:val="Rcsostblzat"/>
@@ -474,12 +497,14 @@
             <w:tcW w:w="3020" w:type="dxa"/>
           </w:tcPr>
           <w:p>
+            <w:proofErr w:type="spellStart"/>
             <w:r>
               <w:t>Id</w:t>
             </w:r>
             <w:r>
               <w:t>U</w:t>
             </w:r>
+            <w:proofErr w:type="spellEnd"/>
           </w:p>
         </w:tc>
         <w:tc>
@@ -509,12 +534,14 @@
             <w:tcW w:w="3020" w:type="dxa"/>
           </w:tcPr>
           <w:p>
+            <w:proofErr w:type="spellStart"/>
             <w:r>
               <w:t>User</w:t>
             </w:r>
             <w:r>
               <w:t>Name</w:t>
             </w:r>
+            <w:proofErr w:type="spellEnd"/>
           </w:p>
         </w:tc>
         <w:tc>
@@ -532,8 +559,13 @@
             <w:tcW w:w="3021" w:type="dxa"/>
           </w:tcPr>
           <w:p>
-            <w:r>
-              <w:t>Varchar (100)</w:t>
+            <w:proofErr w:type="spellStart"/>
+            <w:r>
+              <w:t>Varchar</w:t>
+            </w:r>
+            <w:proofErr w:type="spellEnd"/>
+            <w:r>
+              <w:t xml:space="preserve"> (100)</w:t>
             </w:r>
           </w:p>
         </w:tc>
@@ -544,9 +576,11 @@
             <w:tcW w:w="3020" w:type="dxa"/>
           </w:tcPr>
           <w:p>
+            <w:proofErr w:type="spellStart"/>
             <w:r>
               <w:t>FullName</w:t>
             </w:r>
+            <w:proofErr w:type="spellEnd"/>
           </w:p>
         </w:tc>
         <w:tc>
@@ -564,8 +598,13 @@
             <w:tcW w:w="3021" w:type="dxa"/>
           </w:tcPr>
           <w:p>
-            <w:r>
-              <w:t>Varchar (100)</w:t>
+            <w:proofErr w:type="spellStart"/>
+            <w:r>
+              <w:t>Varchar</w:t>
+            </w:r>
+            <w:proofErr w:type="spellEnd"/>
+            <w:r>
+              <w:t xml:space="preserve"> (100)</w:t>
             </w:r>
           </w:p>
         </w:tc>
@@ -576,28 +615,40 @@
             <w:tcW w:w="3020" w:type="dxa"/>
           </w:tcPr>
           <w:p>
+            <w:proofErr w:type="spellStart"/>
             <w:r>
               <w:t>Password</w:t>
             </w:r>
-          </w:p>
-        </w:tc>
-        <w:tc>
-          <w:tcPr>
-            <w:tcW w:w="3021" w:type="dxa"/>
-          </w:tcPr>
-          <w:p>
-            <w:r>
-              <w:t>Kezelő belépési jelszava</w:t>
-            </w:r>
-          </w:p>
-        </w:tc>
-        <w:tc>
-          <w:tcPr>
-            <w:tcW w:w="3021" w:type="dxa"/>
-          </w:tcPr>
-          <w:p>
-            <w:r>
-              <w:t>Varchar (30)</w:t>
+            <w:proofErr w:type="spellEnd"/>
+          </w:p>
+        </w:tc>
+        <w:tc>
+          <w:tcPr>
+            <w:tcW w:w="3021" w:type="dxa"/>
+          </w:tcPr>
+          <w:p>
+            <w:r>
+              <w:t xml:space="preserve">Kezelő belépési </w:t>
+            </w:r>
+            <w:proofErr w:type="spellStart"/>
+            <w:r>
+              <w:t>jelszava</w:t>
+            </w:r>
+            <w:proofErr w:type="spellEnd"/>
+          </w:p>
+        </w:tc>
+        <w:tc>
+          <w:tcPr>
+            <w:tcW w:w="3021" w:type="dxa"/>
+          </w:tcPr>
+          <w:p>
+            <w:proofErr w:type="spellStart"/>
+            <w:r>
+              <w:t>Varchar</w:t>
+            </w:r>
+            <w:proofErr w:type="spellEnd"/>
+            <w:r>
+              <w:t xml:space="preserve"> (30)</w:t>
             </w:r>
           </w:p>
         </w:tc>
@@ -608,9 +659,14 @@
             <w:tcW w:w="3020" w:type="dxa"/>
           </w:tcPr>
           <w:p>
+            <w:proofErr w:type="spellStart"/>
+            <w:r>
+              <w:t>User</w:t>
+            </w:r>
             <w:r>
               <w:t>Rank</w:t>
             </w:r>
+            <w:proofErr w:type="spellEnd"/>
           </w:p>
         </w:tc>
         <w:tc>
@@ -650,11 +706,32 @@
         </w:numPr>
         <w:jc w:val="both"/>
       </w:pPr>
+      <w:proofErr w:type="spellStart"/>
       <w:r>
         <w:t>Id</w:t>
       </w:r>
       <w:r>
-        <w:t>U (ID for Users)</w:t>
+        <w:t>U</w:t>
+      </w:r>
+      <w:proofErr w:type="spellEnd"/>
+      <w:r>
+        <w:t xml:space="preserve"> (ID </w:t>
+      </w:r>
+      <w:proofErr w:type="spellStart"/>
+      <w:r>
+        <w:t>for</w:t>
+      </w:r>
+      <w:proofErr w:type="spellEnd"/>
+      <w:r>
+        <w:t xml:space="preserve"> </w:t>
+      </w:r>
+      <w:proofErr w:type="spellStart"/>
+      <w:r>
+        <w:t>Users</w:t>
+      </w:r>
+      <w:proofErr w:type="spellEnd"/>
+      <w:r>
+        <w:t>)</w:t>
       </w:r>
       <w:r>
         <w:t>: kezelői egyedi azonosító, a rendszer önműködően generálja</w:t>
@@ -669,11 +746,16 @@
         </w:numPr>
         <w:jc w:val="both"/>
       </w:pPr>
+      <w:proofErr w:type="spellStart"/>
       <w:r>
         <w:t>User</w:t>
       </w:r>
       <w:r>
-        <w:t>Name: a kezelő neve, szabadon beírható szöveges</w:t>
+        <w:t>Name</w:t>
+      </w:r>
+      <w:proofErr w:type="spellEnd"/>
+      <w:r>
+        <w:t>: a kezelő neve, szabadon beírható szöveges</w:t>
       </w:r>
     </w:p>
     <w:p>
@@ -685,8 +767,13 @@
         </w:numPr>
         <w:jc w:val="both"/>
       </w:pPr>
-      <w:r>
-        <w:t>FullName: valódi, kiírt teljes név</w:t>
+      <w:proofErr w:type="spellStart"/>
+      <w:r>
+        <w:t>FullName</w:t>
+      </w:r>
+      <w:proofErr w:type="spellEnd"/>
+      <w:r>
+        <w:t>: valódi, kiírt teljes név</w:t>
       </w:r>
     </w:p>
     <w:p>
@@ -698,8 +785,13 @@
         </w:numPr>
         <w:jc w:val="both"/>
       </w:pPr>
-      <w:r>
-        <w:t>Password: a kezelő által használt belépési jelszó, szabadon beírható szöveg típusú</w:t>
+      <w:proofErr w:type="spellStart"/>
+      <w:r>
+        <w:t>Password</w:t>
+      </w:r>
+      <w:proofErr w:type="spellEnd"/>
+      <w:r>
+        <w:t>: a kezelő által használt belépési jelszó, szabadon beírható szöveg típusú</w:t>
       </w:r>
     </w:p>
     <w:p>
@@ -711,8 +803,16 @@
         </w:numPr>
         <w:jc w:val="both"/>
       </w:pPr>
-      <w:r>
-        <w:t>Rank: besorolás, ami meghatározza a korábban leírt jogosultságokat</w:t>
+      <w:proofErr w:type="spellStart"/>
+      <w:r>
+        <w:t>User</w:t>
+      </w:r>
+      <w:r>
+        <w:t>Rank</w:t>
+      </w:r>
+      <w:proofErr w:type="spellEnd"/>
+      <w:r>
+        <w:t>: besorolás, ami meghatározza a korábban leírt jogosultságokat</w:t>
       </w:r>
     </w:p>
     <w:p>
@@ -735,6 +835,16 @@
       </w:r>
     </w:p>
     <w:p/>
+    <w:p>
+      <w:r>
+        <w:t xml:space="preserve">Tábla: </w:t>
+      </w:r>
+      <w:proofErr w:type="spellStart"/>
+      <w:r>
+        <w:t>goods</w:t>
+      </w:r>
+      <w:proofErr w:type="spellEnd"/>
+    </w:p>
     <w:tbl>
       <w:tblPr>
         <w:tblStyle w:val="Rcsostblzat"/>
@@ -796,9 +906,11 @@
             <w:tcW w:w="3020" w:type="dxa"/>
           </w:tcPr>
           <w:p>
+            <w:proofErr w:type="spellStart"/>
             <w:r>
               <w:t>IdP</w:t>
             </w:r>
+            <w:proofErr w:type="spellEnd"/>
           </w:p>
         </w:tc>
         <w:tc>
@@ -828,9 +940,11 @@
             <w:tcW w:w="3020" w:type="dxa"/>
           </w:tcPr>
           <w:p>
+            <w:proofErr w:type="spellStart"/>
             <w:r>
               <w:t>Article</w:t>
             </w:r>
+            <w:proofErr w:type="spellEnd"/>
           </w:p>
         </w:tc>
         <w:tc>
@@ -848,8 +962,13 @@
             <w:tcW w:w="3021" w:type="dxa"/>
           </w:tcPr>
           <w:p>
-            <w:r>
-              <w:t>Varchar (20)</w:t>
+            <w:proofErr w:type="spellStart"/>
+            <w:r>
+              <w:t>Varchar</w:t>
+            </w:r>
+            <w:proofErr w:type="spellEnd"/>
+            <w:r>
+              <w:t xml:space="preserve"> (20)</w:t>
             </w:r>
           </w:p>
         </w:tc>
@@ -860,9 +979,11 @@
             <w:tcW w:w="3020" w:type="dxa"/>
           </w:tcPr>
           <w:p>
+            <w:proofErr w:type="spellStart"/>
             <w:r>
               <w:t>Barcode</w:t>
             </w:r>
+            <w:proofErr w:type="spellEnd"/>
           </w:p>
         </w:tc>
         <w:tc>
@@ -880,8 +1001,13 @@
             <w:tcW w:w="3021" w:type="dxa"/>
           </w:tcPr>
           <w:p>
-            <w:r>
-              <w:t>Varchar (13)</w:t>
+            <w:proofErr w:type="spellStart"/>
+            <w:r>
+              <w:t>Varchar</w:t>
+            </w:r>
+            <w:proofErr w:type="spellEnd"/>
+            <w:r>
+              <w:t xml:space="preserve"> (13)</w:t>
             </w:r>
           </w:p>
         </w:tc>
@@ -892,9 +1018,11 @@
             <w:tcW w:w="3020" w:type="dxa"/>
           </w:tcPr>
           <w:p>
+            <w:proofErr w:type="spellStart"/>
             <w:r>
               <w:t>Name</w:t>
             </w:r>
+            <w:proofErr w:type="spellEnd"/>
           </w:p>
         </w:tc>
         <w:tc>
@@ -912,8 +1040,13 @@
             <w:tcW w:w="3021" w:type="dxa"/>
           </w:tcPr>
           <w:p>
-            <w:r>
-              <w:t>Varchar (100)</w:t>
+            <w:proofErr w:type="spellStart"/>
+            <w:r>
+              <w:t>Varchar</w:t>
+            </w:r>
+            <w:proofErr w:type="spellEnd"/>
+            <w:r>
+              <w:t xml:space="preserve"> (100)</w:t>
             </w:r>
           </w:p>
         </w:tc>
@@ -944,9 +1077,11 @@
             <w:tcW w:w="3021" w:type="dxa"/>
           </w:tcPr>
           <w:p>
+            <w:proofErr w:type="spellStart"/>
             <w:r>
               <w:t>Float</w:t>
             </w:r>
+            <w:proofErr w:type="spellEnd"/>
           </w:p>
         </w:tc>
       </w:tr>
@@ -956,12 +1091,14 @@
             <w:tcW w:w="3020" w:type="dxa"/>
           </w:tcPr>
           <w:p>
+            <w:proofErr w:type="spellStart"/>
             <w:r>
               <w:t>L</w:t>
             </w:r>
             <w:r>
               <w:t>PPrice</w:t>
             </w:r>
+            <w:proofErr w:type="spellEnd"/>
           </w:p>
         </w:tc>
         <w:tc>
@@ -985,9 +1122,11 @@
             <w:tcW w:w="3021" w:type="dxa"/>
           </w:tcPr>
           <w:p>
+            <w:proofErr w:type="spellStart"/>
             <w:r>
               <w:t>Float</w:t>
             </w:r>
+            <w:proofErr w:type="spellEnd"/>
           </w:p>
         </w:tc>
       </w:tr>
@@ -997,9 +1136,11 @@
             <w:tcW w:w="3020" w:type="dxa"/>
           </w:tcPr>
           <w:p>
+            <w:proofErr w:type="spellStart"/>
             <w:r>
               <w:t>SPrice</w:t>
             </w:r>
+            <w:proofErr w:type="spellEnd"/>
           </w:p>
         </w:tc>
         <w:tc>
@@ -1017,9 +1158,11 @@
             <w:tcW w:w="3021" w:type="dxa"/>
           </w:tcPr>
           <w:p>
+            <w:proofErr w:type="spellStart"/>
             <w:r>
               <w:t>Float</w:t>
             </w:r>
+            <w:proofErr w:type="spellEnd"/>
           </w:p>
         </w:tc>
       </w:tr>
@@ -1049,9 +1192,11 @@
             <w:tcW w:w="3021" w:type="dxa"/>
           </w:tcPr>
           <w:p>
+            <w:proofErr w:type="spellStart"/>
             <w:r>
               <w:t>Float</w:t>
             </w:r>
+            <w:proofErr w:type="spellEnd"/>
           </w:p>
         </w:tc>
       </w:tr>
@@ -1081,9 +1226,11 @@
             <w:tcW w:w="3021" w:type="dxa"/>
           </w:tcPr>
           <w:p>
+            <w:proofErr w:type="spellStart"/>
             <w:r>
               <w:t>Float</w:t>
             </w:r>
+            <w:proofErr w:type="spellEnd"/>
           </w:p>
         </w:tc>
       </w:tr>
@@ -1113,8 +1260,13 @@
             <w:tcW w:w="3021" w:type="dxa"/>
           </w:tcPr>
           <w:p>
-            <w:r>
-              <w:t>Varchar (20)</w:t>
+            <w:proofErr w:type="spellStart"/>
+            <w:r>
+              <w:t>Varchar</w:t>
+            </w:r>
+            <w:proofErr w:type="spellEnd"/>
+            <w:r>
+              <w:t xml:space="preserve"> (20)</w:t>
             </w:r>
           </w:p>
         </w:tc>
@@ -1125,9 +1277,11 @@
             <w:tcW w:w="3020" w:type="dxa"/>
           </w:tcPr>
           <w:p>
+            <w:proofErr w:type="spellStart"/>
             <w:r>
               <w:t>Shelf</w:t>
             </w:r>
+            <w:proofErr w:type="spellEnd"/>
           </w:p>
         </w:tc>
         <w:tc>
@@ -1145,8 +1299,13 @@
             <w:tcW w:w="3021" w:type="dxa"/>
           </w:tcPr>
           <w:p>
-            <w:r>
-              <w:t>Varchar (20)</w:t>
+            <w:proofErr w:type="spellStart"/>
+            <w:r>
+              <w:t>Varchar</w:t>
+            </w:r>
+            <w:proofErr w:type="spellEnd"/>
+            <w:r>
+              <w:t xml:space="preserve"> (20)</w:t>
             </w:r>
           </w:p>
         </w:tc>
@@ -1157,9 +1316,11 @@
             <w:tcW w:w="3020" w:type="dxa"/>
           </w:tcPr>
           <w:p>
+            <w:proofErr w:type="spellStart"/>
             <w:r>
               <w:t>Bundle</w:t>
             </w:r>
+            <w:proofErr w:type="spellEnd"/>
           </w:p>
         </w:tc>
         <w:tc>
@@ -1177,9 +1338,11 @@
             <w:tcW w:w="3021" w:type="dxa"/>
           </w:tcPr>
           <w:p>
+            <w:proofErr w:type="spellStart"/>
             <w:r>
               <w:t>Float</w:t>
             </w:r>
+            <w:proofErr w:type="spellEnd"/>
           </w:p>
         </w:tc>
       </w:tr>
@@ -1189,9 +1352,11 @@
             <w:tcW w:w="3020" w:type="dxa"/>
           </w:tcPr>
           <w:p>
+            <w:proofErr w:type="spellStart"/>
             <w:r>
               <w:t>BUnit</w:t>
             </w:r>
+            <w:proofErr w:type="spellEnd"/>
           </w:p>
         </w:tc>
         <w:tc>
@@ -1209,8 +1374,13 @@
             <w:tcW w:w="3021" w:type="dxa"/>
           </w:tcPr>
           <w:p>
-            <w:r>
-              <w:t>Varchar (20)</w:t>
+            <w:proofErr w:type="spellStart"/>
+            <w:r>
+              <w:t>Varchar</w:t>
+            </w:r>
+            <w:proofErr w:type="spellEnd"/>
+            <w:r>
+              <w:t xml:space="preserve"> (20)</w:t>
             </w:r>
           </w:p>
         </w:tc>
@@ -1234,11 +1404,21 @@
         </w:numPr>
         <w:jc w:val="both"/>
       </w:pPr>
+      <w:proofErr w:type="spellStart"/>
       <w:r>
         <w:t>IdP</w:t>
       </w:r>
-      <w:r>
-        <w:t xml:space="preserve"> (ID for Products)</w:t>
+      <w:proofErr w:type="spellEnd"/>
+      <w:r>
+        <w:t xml:space="preserve"> (ID </w:t>
+      </w:r>
+      <w:proofErr w:type="spellStart"/>
+      <w:r>
+        <w:t>for</w:t>
+      </w:r>
+      <w:proofErr w:type="spellEnd"/>
+      <w:r>
+        <w:t xml:space="preserve"> Products)</w:t>
       </w:r>
       <w:r>
         <w:t>: termék egyedi azonosító, a rendszer önműködően generálja</w:t>
@@ -1253,8 +1433,13 @@
         </w:numPr>
         <w:jc w:val="both"/>
       </w:pPr>
-      <w:r>
-        <w:t>Article: a vállalkozás belső nyilvántartási rendszereinek megfelelően kialakított szöveges/numerikus termék azonosító, mely lehetővé teszi termék csoportok kialakítását a könnyebb kereshetőség és rendezés érdekében</w:t>
+      <w:proofErr w:type="spellStart"/>
+      <w:r>
+        <w:t>Article</w:t>
+      </w:r>
+      <w:proofErr w:type="spellEnd"/>
+      <w:r>
+        <w:t>: a vállalkozás belső nyilvántartási rendszereinek megfelelően kialakított szöveges/numerikus termék azonosító, mely lehetővé teszi termék csoportok kialakítását a könnyebb kereshetőség és rendezés érdekében</w:t>
       </w:r>
     </w:p>
     <w:p>
@@ -1266,8 +1451,21 @@
         </w:numPr>
         <w:jc w:val="both"/>
       </w:pPr>
-      <w:r>
-        <w:t>Barcode: szabványos EAN-13 vonalkód tárolására szolgál. A rendszer így vonalkódolvasó használatával is segíti az azonosítást (billentyűzet interface-es esetben közvetlenül, soros kommunikációra képes eszköznél külön szoftverrel)</w:t>
+      <w:proofErr w:type="spellStart"/>
+      <w:r>
+        <w:t>Barcode</w:t>
+      </w:r>
+      <w:proofErr w:type="spellEnd"/>
+      <w:r>
+        <w:t xml:space="preserve">: szabványos EAN-13 vonalkód tárolására szolgál. A rendszer így vonalkódolvasó használatával is segíti az azonosítást (billentyűzet </w:t>
+      </w:r>
+      <w:proofErr w:type="spellStart"/>
+      <w:r>
+        <w:t>interface</w:t>
+      </w:r>
+      <w:proofErr w:type="spellEnd"/>
+      <w:r>
+        <w:t>-es esetben közvetlenül, soros kommunikációra képes eszköznél külön szoftverrel)</w:t>
       </w:r>
     </w:p>
     <w:p>
@@ -1279,8 +1477,13 @@
         </w:numPr>
         <w:jc w:val="both"/>
       </w:pPr>
-      <w:r>
-        <w:t>Name: a kezelő neve, szabadon beírható szöveges</w:t>
+      <w:proofErr w:type="spellStart"/>
+      <w:r>
+        <w:t>Name</w:t>
+      </w:r>
+      <w:proofErr w:type="spellEnd"/>
+      <w:r>
+        <w:t>: a kezelő neve, szabadon beírható szöveges</w:t>
       </w:r>
     </w:p>
     <w:p>
@@ -1305,8 +1508,21 @@
         </w:numPr>
         <w:jc w:val="both"/>
       </w:pPr>
-      <w:r>
-        <w:t>LPPrice (Last Purchase Price): utolsó beszerzési ár ÁFA nélkül</w:t>
+      <w:proofErr w:type="spellStart"/>
+      <w:r>
+        <w:t>LPPrice</w:t>
+      </w:r>
+      <w:proofErr w:type="spellEnd"/>
+      <w:r>
+        <w:t xml:space="preserve"> (Last </w:t>
+      </w:r>
+      <w:proofErr w:type="spellStart"/>
+      <w:r>
+        <w:t>Purchase</w:t>
+      </w:r>
+      <w:proofErr w:type="spellEnd"/>
+      <w:r>
+        <w:t xml:space="preserve"> Price): utolsó beszerzési ár ÁFA nélkül</w:t>
       </w:r>
     </w:p>
     <w:p>
@@ -1318,8 +1534,21 @@
         </w:numPr>
         <w:jc w:val="both"/>
       </w:pPr>
-      <w:r>
-        <w:t>SPrice (Selling Price): eladási ár ÁFA nélkül</w:t>
+      <w:proofErr w:type="spellStart"/>
+      <w:r>
+        <w:t>SPrice</w:t>
+      </w:r>
+      <w:proofErr w:type="spellEnd"/>
+      <w:r>
+        <w:t xml:space="preserve"> (</w:t>
+      </w:r>
+      <w:proofErr w:type="spellStart"/>
+      <w:r>
+        <w:t>Selling</w:t>
+      </w:r>
+      <w:proofErr w:type="spellEnd"/>
+      <w:r>
+        <w:t xml:space="preserve"> Price): eladási ár ÁFA nélkül</w:t>
       </w:r>
     </w:p>
     <w:p>
@@ -1332,6 +1561,7 @@
         <w:jc w:val="both"/>
       </w:pPr>
       <w:r>
+        <w:lastRenderedPageBreak/>
         <w:t>Stock: a jelenleg készleten lévő mennyiség a mennyiségi egység szerint</w:t>
       </w:r>
     </w:p>
@@ -1345,7 +1575,6 @@
         <w:jc w:val="both"/>
       </w:pPr>
       <w:r>
-        <w:lastRenderedPageBreak/>
         <w:t>MinStock: az előírt, raktáron tartandó minimum készlet mennyisége a mennyiségi egység szerint</w:t>
       </w:r>
     </w:p>
@@ -1371,8 +1600,13 @@
         </w:numPr>
         <w:jc w:val="both"/>
       </w:pPr>
-      <w:r>
-        <w:t>Shelf: a termék fizikai helye a raktárban – főleg nagyobb raktárak esetében egyszerűsíti a megtalálást, ha polckódot alkalmazunk (pl. polcok sorainak betűvel jelölése + azon belüli sorszám pl. C23 – C sor 23. polca meghatározott irányból)</w:t>
+      <w:proofErr w:type="spellStart"/>
+      <w:r>
+        <w:t>Shelf</w:t>
+      </w:r>
+      <w:proofErr w:type="spellEnd"/>
+      <w:r>
+        <w:t>: a termék fizikai helye a raktárban – főleg nagyobb raktárak esetében egyszerűsíti a megtalálást, ha polckódot alkalmazunk (pl. polcok sorainak betűvel jelölése + azon belüli sorszám pl. C23 – C sor 23. polca meghatározott irányból)</w:t>
       </w:r>
     </w:p>
     <w:p>
@@ -1384,11 +1618,24 @@
         </w:numPr>
         <w:jc w:val="both"/>
       </w:pPr>
-      <w:r>
-        <w:t>Bundle: amennyiben a termék gyűjtőben is kapható vagy alapvetően valamilyen gyűjtő rakományban érkezik</w:t>
-      </w:r>
-      <w:r>
-        <w:t>, annak egyszerűbb kezelésére ad lehetőséget és azt adja meg, hogy egy „bundle unit” egységben mennyi van az egyedi termékből</w:t>
+      <w:proofErr w:type="spellStart"/>
+      <w:r>
+        <w:t>Bundle</w:t>
+      </w:r>
+      <w:proofErr w:type="spellEnd"/>
+      <w:r>
+        <w:t>: amennyiben a termék gyűjtőben is kapható vagy alapvetően valamilyen gyűjtő rakományban érkezik</w:t>
+      </w:r>
+      <w:r>
+        <w:t>, annak egyszerűbb kezelésére ad lehetőséget és azt adja meg, hogy egy „</w:t>
+      </w:r>
+      <w:proofErr w:type="spellStart"/>
+      <w:r>
+        <w:t>bundle</w:t>
+      </w:r>
+      <w:proofErr w:type="spellEnd"/>
+      <w:r>
+        <w:t xml:space="preserve"> unit” egységben mennyi van az egyedi termékből</w:t>
       </w:r>
     </w:p>
     <w:p>
@@ -1400,8 +1647,21 @@
         </w:numPr>
         <w:jc w:val="both"/>
       </w:pPr>
-      <w:r>
-        <w:t>BUnit (Bundle Unit): a gyűjtő mennyiségi egysége (köteg, raklap, rekesz)</w:t>
+      <w:proofErr w:type="spellStart"/>
+      <w:r>
+        <w:t>BUnit</w:t>
+      </w:r>
+      <w:proofErr w:type="spellEnd"/>
+      <w:r>
+        <w:t xml:space="preserve"> (</w:t>
+      </w:r>
+      <w:proofErr w:type="spellStart"/>
+      <w:r>
+        <w:t>Bundle</w:t>
+      </w:r>
+      <w:proofErr w:type="spellEnd"/>
+      <w:r>
+        <w:t xml:space="preserve"> Unit): a gyűjtő mennyiségi egysége (köteg, raklap, rekesz)</w:t>
       </w:r>
     </w:p>
     <w:p>
@@ -1418,6 +1678,16 @@
       </w:r>
     </w:p>
     <w:p/>
+    <w:p>
+      <w:r>
+        <w:t xml:space="preserve">Tábla: </w:t>
+      </w:r>
+      <w:proofErr w:type="spellStart"/>
+      <w:r>
+        <w:t>history</w:t>
+      </w:r>
+      <w:proofErr w:type="spellEnd"/>
+    </w:p>
     <w:tbl>
       <w:tblPr>
         <w:tblStyle w:val="Rcsostblzat"/>
@@ -1479,9 +1749,11 @@
             <w:tcW w:w="3020" w:type="dxa"/>
           </w:tcPr>
           <w:p>
+            <w:proofErr w:type="spellStart"/>
             <w:r>
               <w:t>IdH</w:t>
             </w:r>
+            <w:proofErr w:type="spellEnd"/>
           </w:p>
         </w:tc>
         <w:tc>
@@ -1511,18 +1783,28 @@
             <w:tcW w:w="3020" w:type="dxa"/>
           </w:tcPr>
           <w:p>
+            <w:proofErr w:type="spellStart"/>
             <w:r>
               <w:t>IdP</w:t>
             </w:r>
-          </w:p>
-        </w:tc>
-        <w:tc>
-          <w:tcPr>
-            <w:tcW w:w="3021" w:type="dxa"/>
-          </w:tcPr>
-          <w:p>
-            <w:r>
-              <w:t>a termék Id-je, aminek a mozgását tároltuk</w:t>
+            <w:proofErr w:type="spellEnd"/>
+          </w:p>
+        </w:tc>
+        <w:tc>
+          <w:tcPr>
+            <w:tcW w:w="3021" w:type="dxa"/>
+          </w:tcPr>
+          <w:p>
+            <w:r>
+              <w:t xml:space="preserve">a termék </w:t>
+            </w:r>
+            <w:proofErr w:type="spellStart"/>
+            <w:r>
+              <w:t>Id</w:t>
+            </w:r>
+            <w:proofErr w:type="spellEnd"/>
+            <w:r>
+              <w:t>-je, aminek a mozgását tároltuk</w:t>
             </w:r>
           </w:p>
         </w:tc>
@@ -1543,9 +1825,11 @@
             <w:tcW w:w="3020" w:type="dxa"/>
           </w:tcPr>
           <w:p>
+            <w:proofErr w:type="spellStart"/>
             <w:r>
               <w:t>IdU</w:t>
             </w:r>
+            <w:proofErr w:type="spellEnd"/>
           </w:p>
         </w:tc>
         <w:tc>
@@ -1575,9 +1859,11 @@
             <w:tcW w:w="3020" w:type="dxa"/>
           </w:tcPr>
           <w:p>
+            <w:proofErr w:type="spellStart"/>
             <w:r>
               <w:t>Date</w:t>
             </w:r>
+            <w:proofErr w:type="spellEnd"/>
           </w:p>
         </w:tc>
         <w:tc>
@@ -1595,9 +1881,11 @@
             <w:tcW w:w="3021" w:type="dxa"/>
           </w:tcPr>
           <w:p>
+            <w:proofErr w:type="spellStart"/>
             <w:r>
               <w:t>DateTime</w:t>
             </w:r>
+            <w:proofErr w:type="spellEnd"/>
           </w:p>
         </w:tc>
       </w:tr>
@@ -1607,9 +1895,11 @@
             <w:tcW w:w="3020" w:type="dxa"/>
           </w:tcPr>
           <w:p>
+            <w:proofErr w:type="spellStart"/>
             <w:r>
               <w:t>InvoiceNr</w:t>
             </w:r>
+            <w:proofErr w:type="spellEnd"/>
           </w:p>
         </w:tc>
         <w:tc>
@@ -1627,8 +1917,13 @@
             <w:tcW w:w="3021" w:type="dxa"/>
           </w:tcPr>
           <w:p>
-            <w:r>
-              <w:t>Varchar (100)</w:t>
+            <w:proofErr w:type="spellStart"/>
+            <w:r>
+              <w:t>Varchar</w:t>
+            </w:r>
+            <w:proofErr w:type="spellEnd"/>
+            <w:r>
+              <w:t xml:space="preserve"> (100)</w:t>
             </w:r>
           </w:p>
         </w:tc>
@@ -1639,9 +1934,11 @@
             <w:tcW w:w="3020" w:type="dxa"/>
           </w:tcPr>
           <w:p>
+            <w:proofErr w:type="spellStart"/>
             <w:r>
               <w:t>Quantity</w:t>
             </w:r>
+            <w:proofErr w:type="spellEnd"/>
           </w:p>
         </w:tc>
         <w:tc>
@@ -1659,9 +1956,11 @@
             <w:tcW w:w="3021" w:type="dxa"/>
           </w:tcPr>
           <w:p>
+            <w:proofErr w:type="spellStart"/>
             <w:r>
               <w:t>Float</w:t>
             </w:r>
+            <w:proofErr w:type="spellEnd"/>
           </w:p>
         </w:tc>
       </w:tr>
@@ -1671,9 +1970,11 @@
             <w:tcW w:w="3020" w:type="dxa"/>
           </w:tcPr>
           <w:p>
+            <w:proofErr w:type="spellStart"/>
             <w:r>
               <w:t>Direction</w:t>
             </w:r>
+            <w:proofErr w:type="spellEnd"/>
           </w:p>
         </w:tc>
         <w:tc>
@@ -1703,9 +2004,11 @@
             <w:tcW w:w="3020" w:type="dxa"/>
           </w:tcPr>
           <w:p>
+            <w:proofErr w:type="spellStart"/>
             <w:r>
               <w:t>PPrice</w:t>
             </w:r>
+            <w:proofErr w:type="spellEnd"/>
           </w:p>
         </w:tc>
         <w:tc>
@@ -1723,9 +2026,11 @@
             <w:tcW w:w="3021" w:type="dxa"/>
           </w:tcPr>
           <w:p>
+            <w:proofErr w:type="spellStart"/>
             <w:r>
               <w:t>Float</w:t>
             </w:r>
+            <w:proofErr w:type="spellEnd"/>
           </w:p>
         </w:tc>
       </w:tr>
@@ -1735,9 +2040,11 @@
             <w:tcW w:w="3020" w:type="dxa"/>
           </w:tcPr>
           <w:p>
+            <w:proofErr w:type="spellStart"/>
             <w:r>
               <w:t>SPrice</w:t>
             </w:r>
+            <w:proofErr w:type="spellEnd"/>
           </w:p>
         </w:tc>
         <w:tc>
@@ -1755,9 +2062,11 @@
             <w:tcW w:w="3021" w:type="dxa"/>
           </w:tcPr>
           <w:p>
+            <w:proofErr w:type="spellStart"/>
             <w:r>
               <w:t>Float</w:t>
             </w:r>
+            <w:proofErr w:type="spellEnd"/>
           </w:p>
         </w:tc>
       </w:tr>
@@ -1767,9 +2076,14 @@
             <w:tcW w:w="3020" w:type="dxa"/>
           </w:tcPr>
           <w:p>
+            <w:proofErr w:type="spellStart"/>
             <w:r>
               <w:t>Serial</w:t>
             </w:r>
+            <w:r>
+              <w:t>Nr</w:t>
+            </w:r>
+            <w:proofErr w:type="spellEnd"/>
           </w:p>
         </w:tc>
         <w:tc>
@@ -1787,8 +2101,13 @@
             <w:tcW w:w="3021" w:type="dxa"/>
           </w:tcPr>
           <w:p>
-            <w:r>
-              <w:t>Varchar (50)</w:t>
+            <w:proofErr w:type="spellStart"/>
+            <w:r>
+              <w:t>Varchar</w:t>
+            </w:r>
+            <w:proofErr w:type="spellEnd"/>
+            <w:r>
+              <w:t xml:space="preserve"> (50)</w:t>
             </w:r>
           </w:p>
         </w:tc>
@@ -1812,8 +2131,29 @@
         </w:numPr>
         <w:jc w:val="both"/>
       </w:pPr>
-      <w:r>
-        <w:t>IdH (ID for History): a rendszer által generált automatikusan növekvő egész szám</w:t>
+      <w:proofErr w:type="spellStart"/>
+      <w:r>
+        <w:t>IdH</w:t>
+      </w:r>
+      <w:proofErr w:type="spellEnd"/>
+      <w:r>
+        <w:t xml:space="preserve"> (ID </w:t>
+      </w:r>
+      <w:proofErr w:type="spellStart"/>
+      <w:r>
+        <w:t>for</w:t>
+      </w:r>
+      <w:proofErr w:type="spellEnd"/>
+      <w:r>
+        <w:t xml:space="preserve"> </w:t>
+      </w:r>
+      <w:proofErr w:type="spellStart"/>
+      <w:r>
+        <w:t>History</w:t>
+      </w:r>
+      <w:proofErr w:type="spellEnd"/>
+      <w:r>
+        <w:t>): a rendszer által generált automatikusan növekvő egész szám</w:t>
       </w:r>
     </w:p>
     <w:p>
@@ -1825,11 +2165,24 @@
         </w:numPr>
         <w:jc w:val="both"/>
       </w:pPr>
-      <w:r>
-        <w:t>IdP:</w:t>
-      </w:r>
-      <w:r>
-        <w:t xml:space="preserve"> a termék Id-je, aminek a mozgását tároltuk</w:t>
+      <w:proofErr w:type="spellStart"/>
+      <w:r>
+        <w:t>IdP</w:t>
+      </w:r>
+      <w:proofErr w:type="spellEnd"/>
+      <w:r>
+        <w:t>:</w:t>
+      </w:r>
+      <w:r>
+        <w:t xml:space="preserve"> a termék </w:t>
+      </w:r>
+      <w:proofErr w:type="spellStart"/>
+      <w:r>
+        <w:t>Id</w:t>
+      </w:r>
+      <w:proofErr w:type="spellEnd"/>
+      <w:r>
+        <w:t>-je, aminek a mozgását tároltuk</w:t>
       </w:r>
     </w:p>
     <w:p>
@@ -1841,8 +2194,13 @@
         </w:numPr>
         <w:jc w:val="both"/>
       </w:pPr>
-      <w:r>
-        <w:t>IdU:</w:t>
+      <w:proofErr w:type="spellStart"/>
+      <w:r>
+        <w:t>IdU</w:t>
+      </w:r>
+      <w:proofErr w:type="spellEnd"/>
+      <w:r>
+        <w:t>:</w:t>
       </w:r>
       <w:r>
         <w:t xml:space="preserve"> a kezelő azonosítója aki rögzítette</w:t>
@@ -1857,8 +2215,13 @@
         </w:numPr>
         <w:jc w:val="both"/>
       </w:pPr>
-      <w:r>
-        <w:t>Date: itt kell rögzíteni a készletmozgás dátumát</w:t>
+      <w:proofErr w:type="spellStart"/>
+      <w:r>
+        <w:t>Date</w:t>
+      </w:r>
+      <w:proofErr w:type="spellEnd"/>
+      <w:r>
+        <w:t>: itt kell rögzíteni a készletmozgás dátumát</w:t>
       </w:r>
     </w:p>
     <w:p>
@@ -1870,8 +2233,14 @@
         </w:numPr>
         <w:jc w:val="both"/>
       </w:pPr>
-      <w:r>
-        <w:t>InvoiceNr: a számla vagy szállítólevél bizonylatszáma a visszakereshetőség érdekében</w:t>
+      <w:proofErr w:type="spellStart"/>
+      <w:r>
+        <w:lastRenderedPageBreak/>
+        <w:t>InvoiceNr</w:t>
+      </w:r>
+      <w:proofErr w:type="spellEnd"/>
+      <w:r>
+        <w:t>: a számla vagy szállítólevél bizonylatszáma a visszakereshetőség érdekében</w:t>
       </w:r>
     </w:p>
     <w:p>
@@ -1883,6 +2252,7 @@
         </w:numPr>
         <w:jc w:val="both"/>
       </w:pPr>
+      <w:proofErr w:type="spellStart"/>
       <w:r>
         <w:t>Qu</w:t>
       </w:r>
@@ -1890,7 +2260,11 @@
         <w:t>a</w:t>
       </w:r>
       <w:r>
-        <w:t>ntity: A mozgatott mennyiség a termékhez rendelt mennyiségi egység szerint</w:t>
+        <w:t>ntity</w:t>
+      </w:r>
+      <w:proofErr w:type="spellEnd"/>
+      <w:r>
+        <w:t>: A mozgatott mennyiség a termékhez rendelt mennyiségi egység szerint</w:t>
       </w:r>
     </w:p>
     <w:p>
@@ -1902,9 +2276,13 @@
         </w:numPr>
         <w:jc w:val="both"/>
       </w:pPr>
-      <w:r>
-        <w:lastRenderedPageBreak/>
-        <w:t>Direction: a mozgás irányát adhatjuk meg, azon belül is a bevételezés és felhasználás jellegét.</w:t>
+      <w:proofErr w:type="spellStart"/>
+      <w:r>
+        <w:t>Direction</w:t>
+      </w:r>
+      <w:proofErr w:type="spellEnd"/>
+      <w:r>
+        <w:t>: a mozgás irányát adhatjuk meg, azon belül is a bevételezés és felhasználás jellegét.</w:t>
       </w:r>
     </w:p>
     <w:p>
@@ -2046,8 +2424,13 @@
         </w:numPr>
         <w:jc w:val="both"/>
       </w:pPr>
-      <w:r>
-        <w:t xml:space="preserve">PPrice: az aktuális beszerzési </w:t>
+      <w:proofErr w:type="spellStart"/>
+      <w:r>
+        <w:t>PPrice</w:t>
+      </w:r>
+      <w:proofErr w:type="spellEnd"/>
+      <w:r>
+        <w:t xml:space="preserve">: az aktuális beszerzési </w:t>
       </w:r>
       <w:r>
         <w:t>egység</w:t>
@@ -2068,8 +2451,13 @@
         </w:numPr>
         <w:jc w:val="both"/>
       </w:pPr>
-      <w:r>
-        <w:t>SPrice:</w:t>
+      <w:proofErr w:type="spellStart"/>
+      <w:r>
+        <w:t>SPrice</w:t>
+      </w:r>
+      <w:proofErr w:type="spellEnd"/>
+      <w:r>
+        <w:t>:</w:t>
       </w:r>
       <w:r>
         <w:t xml:space="preserve"> eladási/kiadás egységár </w:t>
@@ -2084,8 +2472,16 @@
         </w:numPr>
         <w:jc w:val="both"/>
       </w:pPr>
-      <w:r>
-        <w:t>Serial:</w:t>
+      <w:proofErr w:type="spellStart"/>
+      <w:r>
+        <w:t>Serial</w:t>
+      </w:r>
+      <w:r>
+        <w:t>Nr</w:t>
+      </w:r>
+      <w:proofErr w:type="spellEnd"/>
+      <w:r>
+        <w:t>:</w:t>
       </w:r>
       <w:r>
         <w:t xml:space="preserve"> amennyiben az adott terméknél értelmezhető, annak gyári száma</w:t>
@@ -2419,7 +2815,15 @@
         <w:jc w:val="both"/>
       </w:pPr>
       <w:r>
-        <w:t>Amennyiben még egyáltalán nincs kezelő felvéve, az induláskor kéri egy raktárvezető státuszú felvételét.</w:t>
+        <w:t xml:space="preserve">Amennyiben még egyáltalán nincs kezelő </w:t>
+      </w:r>
+      <w:proofErr w:type="spellStart"/>
+      <w:r>
+        <w:t>felvéve</w:t>
+      </w:r>
+      <w:proofErr w:type="spellEnd"/>
+      <w:r>
+        <w:t>, az induláskor kéri egy raktárvezető státuszú felvételét.</w:t>
       </w:r>
     </w:p>
     <w:p>

</xml_diff>